<commit_message>
docs(paper): refresh team-branded solution paper DOCX
</commit_message>
<xml_diff>
--- a/docs/TEAM TAOTECH SOLUTIONS SOLUTION_PAPER.docx
+++ b/docs/TEAM TAOTECH SOLUTIONS SOLUTION_PAPER.docx
@@ -327,7 +327,25 @@
           <w:sz w:val="24"/>
           <w:szCs w:val="24"/>
         </w:rPr>
-        <w:t>Design constraints: output diversity, reasoning transparency, and low-latency/low-cost deployment.</w:t>
+        <w:t xml:space="preserve">Design constraints: output diversity, reasoning transparency, and </w:t>
+      </w:r>
+      <w:proofErr w:type="gramStart"/>
+      <w:r>
+        <w:rPr>
+          <w:rFonts w:ascii="Times New Roman" w:hAnsi="Times New Roman" w:cs="Times New Roman"/>
+          <w:sz w:val="24"/>
+          <w:szCs w:val="24"/>
+        </w:rPr>
+        <w:t>low-latency</w:t>
+      </w:r>
+      <w:proofErr w:type="gramEnd"/>
+      <w:r>
+        <w:rPr>
+          <w:rFonts w:ascii="Times New Roman" w:hAnsi="Times New Roman" w:cs="Times New Roman"/>
+          <w:sz w:val="24"/>
+          <w:szCs w:val="24"/>
+        </w:rPr>
+        <w:t>/low-cost deployment.</w:t>
       </w:r>
     </w:p>
     <w:p>
@@ -682,7 +700,16 @@
           <w:sz w:val="24"/>
           <w:szCs w:val="24"/>
         </w:rPr>
-        <w:t xml:space="preserve">We use a </w:t>
+        <w:t xml:space="preserve">We use </w:t>
+      </w:r>
+      <w:proofErr w:type="gramStart"/>
+      <w:r>
+        <w:rPr>
+          <w:rFonts w:ascii="Times New Roman" w:hAnsi="Times New Roman" w:cs="Times New Roman"/>
+          <w:sz w:val="24"/>
+          <w:szCs w:val="24"/>
+        </w:rPr>
+        <w:t xml:space="preserve">a </w:t>
       </w:r>
       <w:r>
         <w:rPr>
@@ -691,7 +718,17 @@
           <w:sz w:val="24"/>
           <w:szCs w:val="24"/>
         </w:rPr>
-        <w:t>facts-in, prose-out</w:t>
+        <w:t>facts-</w:t>
+      </w:r>
+      <w:proofErr w:type="gramEnd"/>
+      <w:r>
+        <w:rPr>
+          <w:rFonts w:ascii="Times New Roman" w:hAnsi="Times New Roman" w:cs="Times New Roman"/>
+          <w:b/>
+          <w:sz w:val="24"/>
+          <w:szCs w:val="24"/>
+        </w:rPr>
+        <w:t>in, prose-out</w:t>
       </w:r>
       <w:r>
         <w:rPr>
@@ -735,7 +772,25 @@
           <w:sz w:val="24"/>
           <w:szCs w:val="24"/>
         </w:rPr>
-        <w:t>Retrieval: top-3 related reviews from corpus as style/concreteness references.</w:t>
+        <w:t xml:space="preserve">Retrieval: </w:t>
+      </w:r>
+      <w:proofErr w:type="gramStart"/>
+      <w:r>
+        <w:rPr>
+          <w:rFonts w:ascii="Times New Roman" w:hAnsi="Times New Roman" w:cs="Times New Roman"/>
+          <w:sz w:val="24"/>
+          <w:szCs w:val="24"/>
+        </w:rPr>
+        <w:t>top-3</w:t>
+      </w:r>
+      <w:proofErr w:type="gramEnd"/>
+      <w:r>
+        <w:rPr>
+          <w:rFonts w:ascii="Times New Roman" w:hAnsi="Times New Roman" w:cs="Times New Roman"/>
+          <w:sz w:val="24"/>
+          <w:szCs w:val="24"/>
+        </w:rPr>
+        <w:t xml:space="preserve"> related reviews from corpus as style/concreteness references.</w:t>
       </w:r>
     </w:p>
     <w:p>
@@ -1152,7 +1207,25 @@
           <w:sz w:val="24"/>
           <w:szCs w:val="24"/>
         </w:rPr>
-        <w:t>4.2 Multi-turn behavior</w:t>
+        <w:t xml:space="preserve">4.2 </w:t>
+      </w:r>
+      <w:proofErr w:type="gramStart"/>
+      <w:r>
+        <w:rPr>
+          <w:rFonts w:ascii="Times New Roman" w:hAnsi="Times New Roman" w:cs="Times New Roman"/>
+          <w:sz w:val="24"/>
+          <w:szCs w:val="24"/>
+        </w:rPr>
+        <w:t>Multi-turn</w:t>
+      </w:r>
+      <w:proofErr w:type="gramEnd"/>
+      <w:r>
+        <w:rPr>
+          <w:rFonts w:ascii="Times New Roman" w:hAnsi="Times New Roman" w:cs="Times New Roman"/>
+          <w:sz w:val="24"/>
+          <w:szCs w:val="24"/>
+        </w:rPr>
+        <w:t xml:space="preserve"> behavior</w:t>
       </w:r>
     </w:p>
     <w:p>
@@ -1296,13 +1369,23 @@
           <w:szCs w:val="24"/>
         </w:rPr>
       </w:pPr>
+      <w:proofErr w:type="gramStart"/>
       <w:r>
         <w:rPr>
           <w:rFonts w:ascii="Times New Roman" w:hAnsi="Times New Roman" w:cs="Times New Roman"/>
           <w:sz w:val="24"/>
           <w:szCs w:val="24"/>
         </w:rPr>
-        <w:t>Routed-task and latency chips</w:t>
+        <w:t>Routed-task</w:t>
+      </w:r>
+      <w:proofErr w:type="gramEnd"/>
+      <w:r>
+        <w:rPr>
+          <w:rFonts w:ascii="Times New Roman" w:hAnsi="Times New Roman" w:cs="Times New Roman"/>
+          <w:sz w:val="24"/>
+          <w:szCs w:val="24"/>
+        </w:rPr>
+        <w:t xml:space="preserve"> and latency chips</w:t>
       </w:r>
     </w:p>
     <w:p>
@@ -1662,7 +1745,25 @@
           <w:sz w:val="24"/>
           <w:szCs w:val="24"/>
         </w:rPr>
-        <w:t xml:space="preserve">The UI flow is: </w:t>
+        <w:t xml:space="preserve">The UI flow </w:t>
+      </w:r>
+      <w:proofErr w:type="gramStart"/>
+      <w:r>
+        <w:rPr>
+          <w:rFonts w:ascii="Times New Roman" w:hAnsi="Times New Roman" w:cs="Times New Roman"/>
+          <w:sz w:val="24"/>
+          <w:szCs w:val="24"/>
+        </w:rPr>
+        <w:t>is:</w:t>
+      </w:r>
+      <w:proofErr w:type="gramEnd"/>
+      <w:r>
+        <w:rPr>
+          <w:rFonts w:ascii="Times New Roman" w:hAnsi="Times New Roman" w:cs="Times New Roman"/>
+          <w:sz w:val="24"/>
+          <w:szCs w:val="24"/>
+        </w:rPr>
+        <w:t xml:space="preserve"> </w:t>
       </w:r>
       <w:r>
         <w:rPr>
@@ -1780,7 +1881,7 @@
     </w:p>
     <w:tbl>
       <w:tblPr>
-        <w:tblStyle w:val="GridTable5Dark-Accent3"/>
+        <w:tblStyle w:val="GridTable4-Accent3"/>
         <w:tblW w:w="0" w:type="auto"/>
         <w:tblLook w:val="04A0" w:firstRow="1" w:lastRow="0" w:firstColumn="1" w:lastColumn="0" w:noHBand="0" w:noVBand="1"/>
       </w:tblPr>
@@ -2073,47 +2174,34 @@
     </w:p>
     <w:p>
       <w:pPr>
-        <w:rPr>
-          <w:rFonts w:ascii="Times New Roman" w:hAnsi="Times New Roman" w:cs="Times New Roman"/>
-          <w:sz w:val="24"/>
-          <w:szCs w:val="24"/>
-        </w:rPr>
+        <w:pStyle w:val="Heading3"/>
       </w:pPr>
       <w:r>
-        <w:rPr>
-          <w:rFonts w:ascii="Times New Roman" w:hAnsi="Times New Roman" w:cs="Times New Roman"/>
-          <w:sz w:val="24"/>
-          <w:szCs w:val="24"/>
-        </w:rPr>
         <w:t xml:space="preserve"> 6.2 Task A results</w:t>
       </w:r>
     </w:p>
-    <w:p>
-      <w:pPr>
-        <w:pStyle w:val="Heading3"/>
-        <w:rPr>
-          <w:rFonts w:ascii="Times New Roman" w:hAnsi="Times New Roman" w:cs="Times New Roman"/>
-          <w:sz w:val="24"/>
-          <w:szCs w:val="24"/>
-        </w:rPr>
-      </w:pPr>
-    </w:p>
     <w:tbl>
       <w:tblPr>
+        <w:tblStyle w:val="GridTable4-Accent3"/>
         <w:tblW w:w="0" w:type="auto"/>
+        <w:tblLayout w:type="fixed"/>
         <w:tblLook w:val="04A0" w:firstRow="1" w:lastRow="0" w:firstColumn="1" w:lastColumn="0" w:noHBand="0" w:noVBand="1"/>
       </w:tblPr>
       <w:tblGrid>
-        <w:gridCol w:w="1310"/>
-        <w:gridCol w:w="1123"/>
-        <w:gridCol w:w="1123"/>
-        <w:gridCol w:w="910"/>
-        <w:gridCol w:w="870"/>
+        <w:gridCol w:w="1390"/>
+        <w:gridCol w:w="1508"/>
+        <w:gridCol w:w="1530"/>
+        <w:gridCol w:w="1530"/>
+        <w:gridCol w:w="1170"/>
       </w:tblGrid>
       <w:tr>
+        <w:trPr>
+          <w:cnfStyle w:val="100000000000" w:firstRow="1" w:lastRow="0" w:firstColumn="0" w:lastColumn="0" w:oddVBand="0" w:evenVBand="0" w:oddHBand="0" w:evenHBand="0" w:firstRowFirstColumn="0" w:firstRowLastColumn="0" w:lastRowFirstColumn="0" w:lastRowLastColumn="0"/>
+        </w:trPr>
         <w:tc>
           <w:tcPr>
-            <w:tcW w:w="0" w:type="dxa"/>
+            <w:cnfStyle w:val="001000000000" w:firstRow="0" w:lastRow="0" w:firstColumn="1" w:lastColumn="0" w:oddVBand="0" w:evenVBand="0" w:oddHBand="0" w:evenHBand="0" w:firstRowFirstColumn="0" w:firstRowLastColumn="0" w:lastRowFirstColumn="0" w:lastRowLastColumn="0"/>
+            <w:tcW w:w="1390" w:type="dxa"/>
           </w:tcPr>
           <w:p>
             <w:pPr>
@@ -2135,10 +2223,11 @@
         </w:tc>
         <w:tc>
           <w:tcPr>
-            <w:tcW w:w="0" w:type="dxa"/>
+            <w:tcW w:w="1508" w:type="dxa"/>
           </w:tcPr>
           <w:p>
             <w:pPr>
+              <w:cnfStyle w:val="100000000000" w:firstRow="1" w:lastRow="0" w:firstColumn="0" w:lastColumn="0" w:oddVBand="0" w:evenVBand="0" w:oddHBand="0" w:evenHBand="0" w:firstRowFirstColumn="0" w:firstRowLastColumn="0" w:lastRowFirstColumn="0" w:lastRowLastColumn="0"/>
               <w:rPr>
                 <w:rFonts w:ascii="Times New Roman" w:hAnsi="Times New Roman" w:cs="Times New Roman"/>
                 <w:sz w:val="24"/>
@@ -2157,10 +2246,11 @@
         </w:tc>
         <w:tc>
           <w:tcPr>
-            <w:tcW w:w="0" w:type="dxa"/>
+            <w:tcW w:w="1530" w:type="dxa"/>
           </w:tcPr>
           <w:p>
             <w:pPr>
+              <w:cnfStyle w:val="100000000000" w:firstRow="1" w:lastRow="0" w:firstColumn="0" w:lastColumn="0" w:oddVBand="0" w:evenVBand="0" w:oddHBand="0" w:evenHBand="0" w:firstRowFirstColumn="0" w:firstRowLastColumn="0" w:lastRowFirstColumn="0" w:lastRowLastColumn="0"/>
               <w:rPr>
                 <w:rFonts w:ascii="Times New Roman" w:hAnsi="Times New Roman" w:cs="Times New Roman"/>
                 <w:sz w:val="24"/>
@@ -2179,10 +2269,11 @@
         </w:tc>
         <w:tc>
           <w:tcPr>
-            <w:tcW w:w="0" w:type="dxa"/>
+            <w:tcW w:w="1530" w:type="dxa"/>
           </w:tcPr>
           <w:p>
             <w:pPr>
+              <w:cnfStyle w:val="100000000000" w:firstRow="1" w:lastRow="0" w:firstColumn="0" w:lastColumn="0" w:oddVBand="0" w:evenVBand="0" w:oddHBand="0" w:evenHBand="0" w:firstRowFirstColumn="0" w:firstRowLastColumn="0" w:lastRowFirstColumn="0" w:lastRowLastColumn="0"/>
               <w:rPr>
                 <w:rFonts w:ascii="Times New Roman" w:hAnsi="Times New Roman" w:cs="Times New Roman"/>
                 <w:sz w:val="24"/>
@@ -2201,10 +2292,11 @@
         </w:tc>
         <w:tc>
           <w:tcPr>
-            <w:tcW w:w="0" w:type="dxa"/>
+            <w:tcW w:w="1170" w:type="dxa"/>
           </w:tcPr>
           <w:p>
             <w:pPr>
+              <w:cnfStyle w:val="100000000000" w:firstRow="1" w:lastRow="0" w:firstColumn="0" w:lastColumn="0" w:oddVBand="0" w:evenVBand="0" w:oddHBand="0" w:evenHBand="0" w:firstRowFirstColumn="0" w:firstRowLastColumn="0" w:lastRowFirstColumn="0" w:lastRowLastColumn="0"/>
               <w:rPr>
                 <w:rFonts w:ascii="Times New Roman" w:hAnsi="Times New Roman" w:cs="Times New Roman"/>
                 <w:sz w:val="24"/>
@@ -2223,9 +2315,13 @@
         </w:tc>
       </w:tr>
       <w:tr>
+        <w:trPr>
+          <w:cnfStyle w:val="000000100000" w:firstRow="0" w:lastRow="0" w:firstColumn="0" w:lastColumn="0" w:oddVBand="0" w:evenVBand="0" w:oddHBand="1" w:evenHBand="0" w:firstRowFirstColumn="0" w:firstRowLastColumn="0" w:lastRowFirstColumn="0" w:lastRowLastColumn="0"/>
+        </w:trPr>
         <w:tc>
           <w:tcPr>
-            <w:tcW w:w="0" w:type="dxa"/>
+            <w:cnfStyle w:val="001000000000" w:firstRow="0" w:lastRow="0" w:firstColumn="1" w:lastColumn="0" w:oddVBand="0" w:evenVBand="0" w:oddHBand="0" w:evenHBand="0" w:firstRowFirstColumn="0" w:firstRowLastColumn="0" w:lastRowFirstColumn="0" w:lastRowLastColumn="0"/>
+            <w:tcW w:w="1390" w:type="dxa"/>
           </w:tcPr>
           <w:p>
             <w:pPr>
@@ -2238,7 +2334,6 @@
             <w:r>
               <w:rPr>
                 <w:rFonts w:ascii="Times New Roman" w:hAnsi="Times New Roman" w:cs="Times New Roman"/>
-                <w:b/>
                 <w:sz w:val="24"/>
                 <w:szCs w:val="24"/>
               </w:rPr>
@@ -2248,10 +2343,11 @@
         </w:tc>
         <w:tc>
           <w:tcPr>
-            <w:tcW w:w="0" w:type="dxa"/>
+            <w:tcW w:w="1508" w:type="dxa"/>
           </w:tcPr>
           <w:p>
             <w:pPr>
+              <w:cnfStyle w:val="000000100000" w:firstRow="0" w:lastRow="0" w:firstColumn="0" w:lastColumn="0" w:oddVBand="0" w:evenVBand="0" w:oddHBand="1" w:evenHBand="0" w:firstRowFirstColumn="0" w:firstRowLastColumn="0" w:lastRowFirstColumn="0" w:lastRowLastColumn="0"/>
               <w:rPr>
                 <w:rFonts w:ascii="Times New Roman" w:hAnsi="Times New Roman" w:cs="Times New Roman"/>
                 <w:sz w:val="24"/>
@@ -2270,10 +2366,11 @@
         </w:tc>
         <w:tc>
           <w:tcPr>
-            <w:tcW w:w="0" w:type="dxa"/>
+            <w:tcW w:w="1530" w:type="dxa"/>
           </w:tcPr>
           <w:p>
             <w:pPr>
+              <w:cnfStyle w:val="000000100000" w:firstRow="0" w:lastRow="0" w:firstColumn="0" w:lastColumn="0" w:oddVBand="0" w:evenVBand="0" w:oddHBand="1" w:evenHBand="0" w:firstRowFirstColumn="0" w:firstRowLastColumn="0" w:lastRowFirstColumn="0" w:lastRowLastColumn="0"/>
               <w:rPr>
                 <w:rFonts w:ascii="Times New Roman" w:hAnsi="Times New Roman" w:cs="Times New Roman"/>
                 <w:sz w:val="24"/>
@@ -2292,10 +2389,11 @@
         </w:tc>
         <w:tc>
           <w:tcPr>
-            <w:tcW w:w="0" w:type="dxa"/>
+            <w:tcW w:w="1530" w:type="dxa"/>
           </w:tcPr>
           <w:p>
             <w:pPr>
+              <w:cnfStyle w:val="000000100000" w:firstRow="0" w:lastRow="0" w:firstColumn="0" w:lastColumn="0" w:oddVBand="0" w:evenVBand="0" w:oddHBand="1" w:evenHBand="0" w:firstRowFirstColumn="0" w:firstRowLastColumn="0" w:lastRowFirstColumn="0" w:lastRowLastColumn="0"/>
               <w:rPr>
                 <w:rFonts w:ascii="Times New Roman" w:hAnsi="Times New Roman" w:cs="Times New Roman"/>
                 <w:sz w:val="24"/>
@@ -2314,10 +2412,11 @@
         </w:tc>
         <w:tc>
           <w:tcPr>
-            <w:tcW w:w="0" w:type="dxa"/>
+            <w:tcW w:w="1170" w:type="dxa"/>
           </w:tcPr>
           <w:p>
             <w:pPr>
+              <w:cnfStyle w:val="000000100000" w:firstRow="0" w:lastRow="0" w:firstColumn="0" w:lastColumn="0" w:oddVBand="0" w:evenVBand="0" w:oddHBand="1" w:evenHBand="0" w:firstRowFirstColumn="0" w:firstRowLastColumn="0" w:lastRowFirstColumn="0" w:lastRowLastColumn="0"/>
               <w:rPr>
                 <w:rFonts w:ascii="Times New Roman" w:hAnsi="Times New Roman" w:cs="Times New Roman"/>
                 <w:sz w:val="24"/>
@@ -2338,7 +2437,8 @@
       <w:tr>
         <w:tc>
           <w:tcPr>
-            <w:tcW w:w="0" w:type="dxa"/>
+            <w:cnfStyle w:val="001000000000" w:firstRow="0" w:lastRow="0" w:firstColumn="1" w:lastColumn="0" w:oddVBand="0" w:evenVBand="0" w:oddHBand="0" w:evenHBand="0" w:firstRowFirstColumn="0" w:firstRowLastColumn="0" w:lastRowFirstColumn="0" w:lastRowLastColumn="0"/>
+            <w:tcW w:w="1390" w:type="dxa"/>
           </w:tcPr>
           <w:p>
             <w:pPr>
@@ -2360,10 +2460,11 @@
         </w:tc>
         <w:tc>
           <w:tcPr>
-            <w:tcW w:w="0" w:type="dxa"/>
+            <w:tcW w:w="1508" w:type="dxa"/>
           </w:tcPr>
           <w:p>
             <w:pPr>
+              <w:cnfStyle w:val="000000000000" w:firstRow="0" w:lastRow="0" w:firstColumn="0" w:lastColumn="0" w:oddVBand="0" w:evenVBand="0" w:oddHBand="0" w:evenHBand="0" w:firstRowFirstColumn="0" w:firstRowLastColumn="0" w:lastRowFirstColumn="0" w:lastRowLastColumn="0"/>
               <w:rPr>
                 <w:rFonts w:ascii="Times New Roman" w:hAnsi="Times New Roman" w:cs="Times New Roman"/>
                 <w:sz w:val="24"/>
@@ -2383,10 +2484,11 @@
         </w:tc>
         <w:tc>
           <w:tcPr>
-            <w:tcW w:w="0" w:type="dxa"/>
+            <w:tcW w:w="1530" w:type="dxa"/>
           </w:tcPr>
           <w:p>
             <w:pPr>
+              <w:cnfStyle w:val="000000000000" w:firstRow="0" w:lastRow="0" w:firstColumn="0" w:lastColumn="0" w:oddVBand="0" w:evenVBand="0" w:oddHBand="0" w:evenHBand="0" w:firstRowFirstColumn="0" w:firstRowLastColumn="0" w:lastRowFirstColumn="0" w:lastRowLastColumn="0"/>
               <w:rPr>
                 <w:rFonts w:ascii="Times New Roman" w:hAnsi="Times New Roman" w:cs="Times New Roman"/>
                 <w:sz w:val="24"/>
@@ -2406,10 +2508,11 @@
         </w:tc>
         <w:tc>
           <w:tcPr>
-            <w:tcW w:w="0" w:type="dxa"/>
+            <w:tcW w:w="1530" w:type="dxa"/>
           </w:tcPr>
           <w:p>
             <w:pPr>
+              <w:cnfStyle w:val="000000000000" w:firstRow="0" w:lastRow="0" w:firstColumn="0" w:lastColumn="0" w:oddVBand="0" w:evenVBand="0" w:oddHBand="0" w:evenHBand="0" w:firstRowFirstColumn="0" w:firstRowLastColumn="0" w:lastRowFirstColumn="0" w:lastRowLastColumn="0"/>
               <w:rPr>
                 <w:rFonts w:ascii="Times New Roman" w:hAnsi="Times New Roman" w:cs="Times New Roman"/>
                 <w:sz w:val="24"/>
@@ -2428,10 +2531,11 @@
         </w:tc>
         <w:tc>
           <w:tcPr>
-            <w:tcW w:w="0" w:type="dxa"/>
+            <w:tcW w:w="1170" w:type="dxa"/>
           </w:tcPr>
           <w:p>
             <w:pPr>
+              <w:cnfStyle w:val="000000000000" w:firstRow="0" w:lastRow="0" w:firstColumn="0" w:lastColumn="0" w:oddVBand="0" w:evenVBand="0" w:oddHBand="0" w:evenHBand="0" w:firstRowFirstColumn="0" w:firstRowLastColumn="0" w:lastRowFirstColumn="0" w:lastRowLastColumn="0"/>
               <w:rPr>
                 <w:rFonts w:ascii="Times New Roman" w:hAnsi="Times New Roman" w:cs="Times New Roman"/>
                 <w:sz w:val="24"/>
@@ -2451,9 +2555,13 @@
         </w:tc>
       </w:tr>
       <w:tr>
+        <w:trPr>
+          <w:cnfStyle w:val="000000100000" w:firstRow="0" w:lastRow="0" w:firstColumn="0" w:lastColumn="0" w:oddVBand="0" w:evenVBand="0" w:oddHBand="1" w:evenHBand="0" w:firstRowFirstColumn="0" w:firstRowLastColumn="0" w:lastRowFirstColumn="0" w:lastRowLastColumn="0"/>
+        </w:trPr>
         <w:tc>
           <w:tcPr>
-            <w:tcW w:w="0" w:type="dxa"/>
+            <w:cnfStyle w:val="001000000000" w:firstRow="0" w:lastRow="0" w:firstColumn="1" w:lastColumn="0" w:oddVBand="0" w:evenVBand="0" w:oddHBand="0" w:evenHBand="0" w:firstRowFirstColumn="0" w:firstRowLastColumn="0" w:lastRowFirstColumn="0" w:lastRowLastColumn="0"/>
+            <w:tcW w:w="1390" w:type="dxa"/>
           </w:tcPr>
           <w:p>
             <w:pPr>
@@ -2469,17 +2577,17 @@
                 <w:sz w:val="24"/>
                 <w:szCs w:val="24"/>
               </w:rPr>
-              <w:lastRenderedPageBreak/>
               <w:t>no_critique</w:t>
             </w:r>
           </w:p>
         </w:tc>
         <w:tc>
           <w:tcPr>
-            <w:tcW w:w="0" w:type="dxa"/>
+            <w:tcW w:w="1508" w:type="dxa"/>
           </w:tcPr>
           <w:p>
             <w:pPr>
+              <w:cnfStyle w:val="000000100000" w:firstRow="0" w:lastRow="0" w:firstColumn="0" w:lastColumn="0" w:oddVBand="0" w:evenVBand="0" w:oddHBand="1" w:evenHBand="0" w:firstRowFirstColumn="0" w:firstRowLastColumn="0" w:lastRowFirstColumn="0" w:lastRowLastColumn="0"/>
               <w:rPr>
                 <w:rFonts w:ascii="Times New Roman" w:hAnsi="Times New Roman" w:cs="Times New Roman"/>
                 <w:sz w:val="24"/>
@@ -2498,10 +2606,11 @@
         </w:tc>
         <w:tc>
           <w:tcPr>
-            <w:tcW w:w="0" w:type="dxa"/>
+            <w:tcW w:w="1530" w:type="dxa"/>
           </w:tcPr>
           <w:p>
             <w:pPr>
+              <w:cnfStyle w:val="000000100000" w:firstRow="0" w:lastRow="0" w:firstColumn="0" w:lastColumn="0" w:oddVBand="0" w:evenVBand="0" w:oddHBand="1" w:evenHBand="0" w:firstRowFirstColumn="0" w:firstRowLastColumn="0" w:lastRowFirstColumn="0" w:lastRowLastColumn="0"/>
               <w:rPr>
                 <w:rFonts w:ascii="Times New Roman" w:hAnsi="Times New Roman" w:cs="Times New Roman"/>
                 <w:sz w:val="24"/>
@@ -2520,10 +2629,11 @@
         </w:tc>
         <w:tc>
           <w:tcPr>
-            <w:tcW w:w="0" w:type="dxa"/>
+            <w:tcW w:w="1530" w:type="dxa"/>
           </w:tcPr>
           <w:p>
             <w:pPr>
+              <w:cnfStyle w:val="000000100000" w:firstRow="0" w:lastRow="0" w:firstColumn="0" w:lastColumn="0" w:oddVBand="0" w:evenVBand="0" w:oddHBand="1" w:evenHBand="0" w:firstRowFirstColumn="0" w:firstRowLastColumn="0" w:lastRowFirstColumn="0" w:lastRowLastColumn="0"/>
               <w:rPr>
                 <w:rFonts w:ascii="Times New Roman" w:hAnsi="Times New Roman" w:cs="Times New Roman"/>
                 <w:sz w:val="24"/>
@@ -2543,10 +2653,11 @@
         </w:tc>
         <w:tc>
           <w:tcPr>
-            <w:tcW w:w="0" w:type="dxa"/>
+            <w:tcW w:w="1170" w:type="dxa"/>
           </w:tcPr>
           <w:p>
             <w:pPr>
+              <w:cnfStyle w:val="000000100000" w:firstRow="0" w:lastRow="0" w:firstColumn="0" w:lastColumn="0" w:oddVBand="0" w:evenVBand="0" w:oddHBand="1" w:evenHBand="0" w:firstRowFirstColumn="0" w:firstRowLastColumn="0" w:lastRowFirstColumn="0" w:lastRowLastColumn="0"/>
               <w:rPr>
                 <w:rFonts w:ascii="Times New Roman" w:hAnsi="Times New Roman" w:cs="Times New Roman"/>
                 <w:sz w:val="24"/>
@@ -2567,7 +2678,8 @@
       <w:tr>
         <w:tc>
           <w:tcPr>
-            <w:tcW w:w="0" w:type="dxa"/>
+            <w:cnfStyle w:val="001000000000" w:firstRow="0" w:lastRow="0" w:firstColumn="1" w:lastColumn="0" w:oddVBand="0" w:evenVBand="0" w:oddHBand="0" w:evenHBand="0" w:firstRowFirstColumn="0" w:firstRowLastColumn="0" w:lastRowFirstColumn="0" w:lastRowLastColumn="0"/>
+            <w:tcW w:w="1390" w:type="dxa"/>
           </w:tcPr>
           <w:p>
             <w:pPr>
@@ -2589,10 +2701,11 @@
         </w:tc>
         <w:tc>
           <w:tcPr>
-            <w:tcW w:w="0" w:type="dxa"/>
+            <w:tcW w:w="1508" w:type="dxa"/>
           </w:tcPr>
           <w:p>
             <w:pPr>
+              <w:cnfStyle w:val="000000000000" w:firstRow="0" w:lastRow="0" w:firstColumn="0" w:lastColumn="0" w:oddVBand="0" w:evenVBand="0" w:oddHBand="0" w:evenHBand="0" w:firstRowFirstColumn="0" w:firstRowLastColumn="0" w:lastRowFirstColumn="0" w:lastRowLastColumn="0"/>
               <w:rPr>
                 <w:rFonts w:ascii="Times New Roman" w:hAnsi="Times New Roman" w:cs="Times New Roman"/>
                 <w:sz w:val="24"/>
@@ -2611,10 +2724,11 @@
         </w:tc>
         <w:tc>
           <w:tcPr>
-            <w:tcW w:w="0" w:type="dxa"/>
+            <w:tcW w:w="1530" w:type="dxa"/>
           </w:tcPr>
           <w:p>
             <w:pPr>
+              <w:cnfStyle w:val="000000000000" w:firstRow="0" w:lastRow="0" w:firstColumn="0" w:lastColumn="0" w:oddVBand="0" w:evenVBand="0" w:oddHBand="0" w:evenHBand="0" w:firstRowFirstColumn="0" w:firstRowLastColumn="0" w:lastRowFirstColumn="0" w:lastRowLastColumn="0"/>
               <w:rPr>
                 <w:rFonts w:ascii="Times New Roman" w:hAnsi="Times New Roman" w:cs="Times New Roman"/>
                 <w:sz w:val="24"/>
@@ -2633,10 +2747,11 @@
         </w:tc>
         <w:tc>
           <w:tcPr>
-            <w:tcW w:w="0" w:type="dxa"/>
+            <w:tcW w:w="1530" w:type="dxa"/>
           </w:tcPr>
           <w:p>
             <w:pPr>
+              <w:cnfStyle w:val="000000000000" w:firstRow="0" w:lastRow="0" w:firstColumn="0" w:lastColumn="0" w:oddVBand="0" w:evenVBand="0" w:oddHBand="0" w:evenHBand="0" w:firstRowFirstColumn="0" w:firstRowLastColumn="0" w:lastRowFirstColumn="0" w:lastRowLastColumn="0"/>
               <w:rPr>
                 <w:rFonts w:ascii="Times New Roman" w:hAnsi="Times New Roman" w:cs="Times New Roman"/>
                 <w:sz w:val="24"/>
@@ -2655,10 +2770,11 @@
         </w:tc>
         <w:tc>
           <w:tcPr>
-            <w:tcW w:w="0" w:type="dxa"/>
+            <w:tcW w:w="1170" w:type="dxa"/>
           </w:tcPr>
           <w:p>
             <w:pPr>
+              <w:cnfStyle w:val="000000000000" w:firstRow="0" w:lastRow="0" w:firstColumn="0" w:lastColumn="0" w:oddVBand="0" w:evenVBand="0" w:oddHBand="0" w:evenHBand="0" w:firstRowFirstColumn="0" w:firstRowLastColumn="0" w:lastRowFirstColumn="0" w:lastRowLastColumn="0"/>
               <w:rPr>
                 <w:rFonts w:ascii="Times New Roman" w:hAnsi="Times New Roman" w:cs="Times New Roman"/>
                 <w:sz w:val="24"/>
@@ -2685,13 +2801,22 @@
           <w:szCs w:val="24"/>
         </w:rPr>
       </w:pPr>
+    </w:p>
+    <w:p>
+      <w:pPr>
+        <w:rPr>
+          <w:rFonts w:ascii="Times New Roman" w:hAnsi="Times New Roman" w:cs="Times New Roman"/>
+          <w:sz w:val="24"/>
+          <w:szCs w:val="24"/>
+        </w:rPr>
+      </w:pPr>
       <w:r>
         <w:rPr>
           <w:rFonts w:ascii="Times New Roman" w:hAnsi="Times New Roman" w:cs="Times New Roman"/>
           <w:sz w:val="24"/>
           <w:szCs w:val="24"/>
         </w:rPr>
-        <w:t xml:space="preserve"> </w:t>
+        <w:t>Interpretation: LLM generation is the strongest quality lever (largest drop in no_llm), RAG can lower lexical overlap while improving concreteness, and critique mainly improves qualitative quality.</w:t>
       </w:r>
     </w:p>
     <w:p>
@@ -2702,17 +2827,10 @@
           <w:szCs w:val="24"/>
         </w:rPr>
       </w:pPr>
-      <w:r>
-        <w:rPr>
-          <w:rFonts w:ascii="Times New Roman" w:hAnsi="Times New Roman" w:cs="Times New Roman"/>
-          <w:sz w:val="24"/>
-          <w:szCs w:val="24"/>
-        </w:rPr>
-        <w:t xml:space="preserve"> </w:t>
-      </w:r>
     </w:p>
     <w:p>
       <w:pPr>
+        <w:pStyle w:val="Heading3"/>
         <w:rPr>
           <w:rFonts w:ascii="Times New Roman" w:hAnsi="Times New Roman" w:cs="Times New Roman"/>
           <w:sz w:val="24"/>
@@ -2725,416 +2843,28 @@
           <w:sz w:val="24"/>
           <w:szCs w:val="24"/>
         </w:rPr>
-        <w:t xml:space="preserve"> </w:t>
-      </w:r>
-    </w:p>
-    <w:p>
-      <w:pPr>
-        <w:rPr>
-          <w:rFonts w:ascii="Times New Roman" w:hAnsi="Times New Roman" w:cs="Times New Roman"/>
-          <w:sz w:val="24"/>
-          <w:szCs w:val="24"/>
-        </w:rPr>
-      </w:pPr>
-      <w:r>
-        <w:rPr>
-          <w:rFonts w:ascii="Times New Roman" w:hAnsi="Times New Roman" w:cs="Times New Roman"/>
-          <w:sz w:val="24"/>
-          <w:szCs w:val="24"/>
-        </w:rPr>
-        <w:t xml:space="preserve"> </w:t>
-      </w:r>
-    </w:p>
-    <w:p>
-      <w:pPr>
-        <w:rPr>
-          <w:rFonts w:ascii="Times New Roman" w:hAnsi="Times New Roman" w:cs="Times New Roman"/>
-          <w:sz w:val="24"/>
-          <w:szCs w:val="24"/>
-        </w:rPr>
-      </w:pPr>
-      <w:r>
-        <w:rPr>
-          <w:rFonts w:ascii="Times New Roman" w:hAnsi="Times New Roman" w:cs="Times New Roman"/>
-          <w:sz w:val="24"/>
-          <w:szCs w:val="24"/>
-        </w:rPr>
-        <w:t xml:space="preserve"> </w:t>
-      </w:r>
-    </w:p>
-    <w:p>
-      <w:pPr>
-        <w:rPr>
-          <w:rFonts w:ascii="Times New Roman" w:hAnsi="Times New Roman" w:cs="Times New Roman"/>
-          <w:sz w:val="24"/>
-          <w:szCs w:val="24"/>
-        </w:rPr>
-      </w:pPr>
-      <w:r>
-        <w:rPr>
-          <w:rFonts w:ascii="Times New Roman" w:hAnsi="Times New Roman" w:cs="Times New Roman"/>
-          <w:sz w:val="24"/>
-          <w:szCs w:val="24"/>
-        </w:rPr>
-        <w:t xml:space="preserve"> </w:t>
-      </w:r>
-    </w:p>
-    <w:p>
-      <w:pPr>
-        <w:rPr>
-          <w:rFonts w:ascii="Times New Roman" w:hAnsi="Times New Roman" w:cs="Times New Roman"/>
-          <w:sz w:val="24"/>
-          <w:szCs w:val="24"/>
-        </w:rPr>
-      </w:pPr>
-      <w:r>
-        <w:rPr>
-          <w:rFonts w:ascii="Times New Roman" w:hAnsi="Times New Roman" w:cs="Times New Roman"/>
-          <w:sz w:val="24"/>
-          <w:szCs w:val="24"/>
-        </w:rPr>
-        <w:t xml:space="preserve"> </w:t>
-      </w:r>
-    </w:p>
-    <w:p>
-      <w:pPr>
-        <w:rPr>
-          <w:rFonts w:ascii="Times New Roman" w:hAnsi="Times New Roman" w:cs="Times New Roman"/>
-          <w:sz w:val="24"/>
-          <w:szCs w:val="24"/>
-        </w:rPr>
-      </w:pPr>
-      <w:r>
-        <w:rPr>
-          <w:rFonts w:ascii="Times New Roman" w:hAnsi="Times New Roman" w:cs="Times New Roman"/>
-          <w:sz w:val="24"/>
-          <w:szCs w:val="24"/>
-        </w:rPr>
-        <w:t xml:space="preserve"> </w:t>
-      </w:r>
-    </w:p>
-    <w:p>
-      <w:pPr>
-        <w:rPr>
-          <w:rFonts w:ascii="Times New Roman" w:hAnsi="Times New Roman" w:cs="Times New Roman"/>
-          <w:sz w:val="24"/>
-          <w:szCs w:val="24"/>
-        </w:rPr>
-      </w:pPr>
-      <w:r>
-        <w:rPr>
-          <w:rFonts w:ascii="Times New Roman" w:hAnsi="Times New Roman" w:cs="Times New Roman"/>
-          <w:sz w:val="24"/>
-          <w:szCs w:val="24"/>
-        </w:rPr>
-        <w:t xml:space="preserve"> </w:t>
-      </w:r>
-    </w:p>
-    <w:p>
-      <w:pPr>
-        <w:rPr>
-          <w:rFonts w:ascii="Times New Roman" w:hAnsi="Times New Roman" w:cs="Times New Roman"/>
-          <w:sz w:val="24"/>
-          <w:szCs w:val="24"/>
-        </w:rPr>
-      </w:pPr>
-      <w:r>
-        <w:rPr>
-          <w:rFonts w:ascii="Times New Roman" w:hAnsi="Times New Roman" w:cs="Times New Roman"/>
-          <w:sz w:val="24"/>
-          <w:szCs w:val="24"/>
-        </w:rPr>
-        <w:t xml:space="preserve"> </w:t>
-      </w:r>
-    </w:p>
-    <w:p>
-      <w:pPr>
-        <w:rPr>
-          <w:rFonts w:ascii="Times New Roman" w:hAnsi="Times New Roman" w:cs="Times New Roman"/>
-          <w:sz w:val="24"/>
-          <w:szCs w:val="24"/>
-        </w:rPr>
-      </w:pPr>
-      <w:r>
-        <w:rPr>
-          <w:rFonts w:ascii="Times New Roman" w:hAnsi="Times New Roman" w:cs="Times New Roman"/>
-          <w:sz w:val="24"/>
-          <w:szCs w:val="24"/>
-        </w:rPr>
-        <w:t xml:space="preserve"> </w:t>
-      </w:r>
-    </w:p>
-    <w:p>
-      <w:pPr>
-        <w:rPr>
-          <w:rFonts w:ascii="Times New Roman" w:hAnsi="Times New Roman" w:cs="Times New Roman"/>
-          <w:sz w:val="24"/>
-          <w:szCs w:val="24"/>
-        </w:rPr>
-      </w:pPr>
-      <w:r>
-        <w:rPr>
-          <w:rFonts w:ascii="Times New Roman" w:hAnsi="Times New Roman" w:cs="Times New Roman"/>
-          <w:sz w:val="24"/>
-          <w:szCs w:val="24"/>
-        </w:rPr>
-        <w:t xml:space="preserve"> </w:t>
-      </w:r>
-    </w:p>
-    <w:p>
-      <w:pPr>
-        <w:rPr>
-          <w:rFonts w:ascii="Times New Roman" w:hAnsi="Times New Roman" w:cs="Times New Roman"/>
-          <w:sz w:val="24"/>
-          <w:szCs w:val="24"/>
-        </w:rPr>
-      </w:pPr>
-      <w:r>
-        <w:rPr>
-          <w:rFonts w:ascii="Times New Roman" w:hAnsi="Times New Roman" w:cs="Times New Roman"/>
-          <w:sz w:val="24"/>
-          <w:szCs w:val="24"/>
-        </w:rPr>
-        <w:t xml:space="preserve"> </w:t>
-      </w:r>
-    </w:p>
-    <w:p>
-      <w:pPr>
-        <w:rPr>
-          <w:rFonts w:ascii="Times New Roman" w:hAnsi="Times New Roman" w:cs="Times New Roman"/>
-          <w:sz w:val="24"/>
-          <w:szCs w:val="24"/>
-        </w:rPr>
-      </w:pPr>
-      <w:r>
-        <w:rPr>
-          <w:rFonts w:ascii="Times New Roman" w:hAnsi="Times New Roman" w:cs="Times New Roman"/>
-          <w:sz w:val="24"/>
-          <w:szCs w:val="24"/>
-        </w:rPr>
-        <w:t xml:space="preserve"> </w:t>
-      </w:r>
-    </w:p>
-    <w:p>
-      <w:pPr>
-        <w:rPr>
-          <w:rFonts w:ascii="Times New Roman" w:hAnsi="Times New Roman" w:cs="Times New Roman"/>
-          <w:sz w:val="24"/>
-          <w:szCs w:val="24"/>
-        </w:rPr>
-      </w:pPr>
-      <w:r>
-        <w:rPr>
-          <w:rFonts w:ascii="Times New Roman" w:hAnsi="Times New Roman" w:cs="Times New Roman"/>
-          <w:sz w:val="24"/>
-          <w:szCs w:val="24"/>
-        </w:rPr>
-        <w:t xml:space="preserve"> </w:t>
-      </w:r>
-    </w:p>
-    <w:p>
-      <w:pPr>
-        <w:rPr>
-          <w:rFonts w:ascii="Times New Roman" w:hAnsi="Times New Roman" w:cs="Times New Roman"/>
-          <w:sz w:val="24"/>
-          <w:szCs w:val="24"/>
-        </w:rPr>
-      </w:pPr>
-      <w:r>
-        <w:rPr>
-          <w:rFonts w:ascii="Times New Roman" w:hAnsi="Times New Roman" w:cs="Times New Roman"/>
-          <w:sz w:val="24"/>
-          <w:szCs w:val="24"/>
-        </w:rPr>
-        <w:t xml:space="preserve"> </w:t>
-      </w:r>
-    </w:p>
-    <w:p>
-      <w:pPr>
-        <w:rPr>
-          <w:rFonts w:ascii="Times New Roman" w:hAnsi="Times New Roman" w:cs="Times New Roman"/>
-          <w:sz w:val="24"/>
-          <w:szCs w:val="24"/>
-        </w:rPr>
-      </w:pPr>
-      <w:r>
-        <w:rPr>
-          <w:rFonts w:ascii="Times New Roman" w:hAnsi="Times New Roman" w:cs="Times New Roman"/>
-          <w:sz w:val="24"/>
-          <w:szCs w:val="24"/>
-        </w:rPr>
-        <w:t xml:space="preserve"> </w:t>
-      </w:r>
-    </w:p>
-    <w:p>
-      <w:pPr>
-        <w:rPr>
-          <w:rFonts w:ascii="Times New Roman" w:hAnsi="Times New Roman" w:cs="Times New Roman"/>
-          <w:sz w:val="24"/>
-          <w:szCs w:val="24"/>
-        </w:rPr>
-      </w:pPr>
-      <w:r>
-        <w:rPr>
-          <w:rFonts w:ascii="Times New Roman" w:hAnsi="Times New Roman" w:cs="Times New Roman"/>
-          <w:sz w:val="24"/>
-          <w:szCs w:val="24"/>
-        </w:rPr>
-        <w:t xml:space="preserve"> </w:t>
-      </w:r>
-    </w:p>
-    <w:p>
-      <w:pPr>
-        <w:rPr>
-          <w:rFonts w:ascii="Times New Roman" w:hAnsi="Times New Roman" w:cs="Times New Roman"/>
-          <w:sz w:val="24"/>
-          <w:szCs w:val="24"/>
-        </w:rPr>
-      </w:pPr>
-      <w:r>
-        <w:rPr>
-          <w:rFonts w:ascii="Times New Roman" w:hAnsi="Times New Roman" w:cs="Times New Roman"/>
-          <w:sz w:val="24"/>
-          <w:szCs w:val="24"/>
-        </w:rPr>
-        <w:t xml:space="preserve"> </w:t>
-      </w:r>
-    </w:p>
-    <w:p>
-      <w:pPr>
-        <w:rPr>
-          <w:rFonts w:ascii="Times New Roman" w:hAnsi="Times New Roman" w:cs="Times New Roman"/>
-          <w:sz w:val="24"/>
-          <w:szCs w:val="24"/>
-        </w:rPr>
-      </w:pPr>
-      <w:r>
-        <w:rPr>
-          <w:rFonts w:ascii="Times New Roman" w:hAnsi="Times New Roman" w:cs="Times New Roman"/>
-          <w:sz w:val="24"/>
-          <w:szCs w:val="24"/>
-        </w:rPr>
-        <w:t xml:space="preserve"> </w:t>
-      </w:r>
-    </w:p>
-    <w:p>
-      <w:pPr>
-        <w:rPr>
-          <w:rFonts w:ascii="Times New Roman" w:hAnsi="Times New Roman" w:cs="Times New Roman"/>
-          <w:sz w:val="24"/>
-          <w:szCs w:val="24"/>
-        </w:rPr>
-      </w:pPr>
-      <w:r>
-        <w:rPr>
-          <w:rFonts w:ascii="Times New Roman" w:hAnsi="Times New Roman" w:cs="Times New Roman"/>
-          <w:sz w:val="24"/>
-          <w:szCs w:val="24"/>
-        </w:rPr>
-        <w:t xml:space="preserve"> </w:t>
-      </w:r>
-    </w:p>
-    <w:p>
-      <w:pPr>
-        <w:rPr>
-          <w:rFonts w:ascii="Times New Roman" w:hAnsi="Times New Roman" w:cs="Times New Roman"/>
-          <w:sz w:val="24"/>
-          <w:szCs w:val="24"/>
-        </w:rPr>
-      </w:pPr>
-      <w:r>
-        <w:rPr>
-          <w:rFonts w:ascii="Times New Roman" w:hAnsi="Times New Roman" w:cs="Times New Roman"/>
-          <w:sz w:val="24"/>
-          <w:szCs w:val="24"/>
-        </w:rPr>
-        <w:t xml:space="preserve"> </w:t>
-      </w:r>
-    </w:p>
-    <w:p>
-      <w:pPr>
-        <w:rPr>
-          <w:rFonts w:ascii="Times New Roman" w:hAnsi="Times New Roman" w:cs="Times New Roman"/>
-          <w:sz w:val="24"/>
-          <w:szCs w:val="24"/>
-        </w:rPr>
-      </w:pPr>
-      <w:r>
-        <w:rPr>
-          <w:rFonts w:ascii="Times New Roman" w:hAnsi="Times New Roman" w:cs="Times New Roman"/>
-          <w:sz w:val="24"/>
-          <w:szCs w:val="24"/>
-        </w:rPr>
-        <w:t xml:space="preserve"> </w:t>
-      </w:r>
-    </w:p>
-    <w:p>
-      <w:pPr>
-        <w:rPr>
-          <w:rFonts w:ascii="Times New Roman" w:hAnsi="Times New Roman" w:cs="Times New Roman"/>
-          <w:sz w:val="24"/>
-          <w:szCs w:val="24"/>
-        </w:rPr>
-      </w:pPr>
-      <w:r>
-        <w:rPr>
-          <w:rFonts w:ascii="Times New Roman" w:hAnsi="Times New Roman" w:cs="Times New Roman"/>
-          <w:sz w:val="24"/>
-          <w:szCs w:val="24"/>
-        </w:rPr>
-        <w:t xml:space="preserve"> </w:t>
-      </w:r>
-    </w:p>
-    <w:p>
-      <w:pPr>
-        <w:rPr>
-          <w:rFonts w:ascii="Times New Roman" w:hAnsi="Times New Roman" w:cs="Times New Roman"/>
-          <w:sz w:val="24"/>
-          <w:szCs w:val="24"/>
-        </w:rPr>
-      </w:pPr>
-      <w:r>
-        <w:rPr>
-          <w:rFonts w:ascii="Times New Roman" w:hAnsi="Times New Roman" w:cs="Times New Roman"/>
-          <w:sz w:val="24"/>
-          <w:szCs w:val="24"/>
-        </w:rPr>
-        <w:t xml:space="preserve"> Interpretation: LLM generation is the strongest quality lever (largest drop in no_llm), RAG can lower lexical overlap while improving concreteness, and critique mainly improves qualitative quality.</w:t>
-      </w:r>
-    </w:p>
-    <w:p>
-      <w:pPr>
-        <w:pStyle w:val="Heading3"/>
-        <w:rPr>
-          <w:rFonts w:ascii="Times New Roman" w:hAnsi="Times New Roman" w:cs="Times New Roman"/>
-          <w:sz w:val="24"/>
-          <w:szCs w:val="24"/>
-        </w:rPr>
-      </w:pPr>
-      <w:r>
-        <w:rPr>
-          <w:rFonts w:ascii="Times New Roman" w:hAnsi="Times New Roman" w:cs="Times New Roman"/>
-          <w:sz w:val="24"/>
-          <w:szCs w:val="24"/>
-        </w:rPr>
-        <w:lastRenderedPageBreak/>
         <w:t>6.3 Task B results</w:t>
       </w:r>
     </w:p>
     <w:tbl>
       <w:tblPr>
+        <w:tblStyle w:val="GridTable4-Accent3"/>
         <w:tblW w:w="0" w:type="auto"/>
         <w:tblLook w:val="04A0" w:firstRow="1" w:lastRow="0" w:firstColumn="1" w:lastColumn="0" w:noHBand="0" w:noVBand="1"/>
       </w:tblPr>
       <w:tblGrid>
-        <w:gridCol w:w="1310"/>
-        <w:gridCol w:w="1358"/>
-        <w:gridCol w:w="1117"/>
+        <w:gridCol w:w="1390"/>
+        <w:gridCol w:w="1386"/>
+        <w:gridCol w:w="2282"/>
       </w:tblGrid>
       <w:tr>
+        <w:trPr>
+          <w:cnfStyle w:val="100000000000" w:firstRow="1" w:lastRow="0" w:firstColumn="0" w:lastColumn="0" w:oddVBand="0" w:evenVBand="0" w:oddHBand="0" w:evenHBand="0" w:firstRowFirstColumn="0" w:firstRowLastColumn="0" w:lastRowFirstColumn="0" w:lastRowLastColumn="0"/>
+        </w:trPr>
         <w:tc>
           <w:tcPr>
-            <w:tcW w:w="0" w:type="dxa"/>
+            <w:cnfStyle w:val="001000000000" w:firstRow="0" w:lastRow="0" w:firstColumn="1" w:lastColumn="0" w:oddVBand="0" w:evenVBand="0" w:oddHBand="0" w:evenHBand="0" w:firstRowFirstColumn="0" w:firstRowLastColumn="0" w:lastRowFirstColumn="0" w:lastRowLastColumn="0"/>
+            <w:tcW w:w="1390" w:type="dxa"/>
           </w:tcPr>
           <w:p>
             <w:pPr>
@@ -3156,10 +2886,11 @@
         </w:tc>
         <w:tc>
           <w:tcPr>
-            <w:tcW w:w="0" w:type="dxa"/>
+            <w:tcW w:w="1386" w:type="dxa"/>
           </w:tcPr>
           <w:p>
             <w:pPr>
+              <w:cnfStyle w:val="100000000000" w:firstRow="1" w:lastRow="0" w:firstColumn="0" w:lastColumn="0" w:oddVBand="0" w:evenVBand="0" w:oddHBand="0" w:evenHBand="0" w:firstRowFirstColumn="0" w:firstRowLastColumn="0" w:lastRowFirstColumn="0" w:lastRowLastColumn="0"/>
               <w:rPr>
                 <w:rFonts w:ascii="Times New Roman" w:hAnsi="Times New Roman" w:cs="Times New Roman"/>
                 <w:sz w:val="24"/>
@@ -3178,10 +2909,11 @@
         </w:tc>
         <w:tc>
           <w:tcPr>
-            <w:tcW w:w="0" w:type="dxa"/>
+            <w:tcW w:w="2282" w:type="dxa"/>
           </w:tcPr>
           <w:p>
             <w:pPr>
+              <w:cnfStyle w:val="100000000000" w:firstRow="1" w:lastRow="0" w:firstColumn="0" w:lastColumn="0" w:oddVBand="0" w:evenVBand="0" w:oddHBand="0" w:evenHBand="0" w:firstRowFirstColumn="0" w:firstRowLastColumn="0" w:lastRowFirstColumn="0" w:lastRowLastColumn="0"/>
               <w:rPr>
                 <w:rFonts w:ascii="Times New Roman" w:hAnsi="Times New Roman" w:cs="Times New Roman"/>
                 <w:sz w:val="24"/>
@@ -3200,9 +2932,13 @@
         </w:tc>
       </w:tr>
       <w:tr>
+        <w:trPr>
+          <w:cnfStyle w:val="000000100000" w:firstRow="0" w:lastRow="0" w:firstColumn="0" w:lastColumn="0" w:oddVBand="0" w:evenVBand="0" w:oddHBand="1" w:evenHBand="0" w:firstRowFirstColumn="0" w:firstRowLastColumn="0" w:lastRowFirstColumn="0" w:lastRowLastColumn="0"/>
+        </w:trPr>
         <w:tc>
           <w:tcPr>
-            <w:tcW w:w="0" w:type="dxa"/>
+            <w:cnfStyle w:val="001000000000" w:firstRow="0" w:lastRow="0" w:firstColumn="1" w:lastColumn="0" w:oddVBand="0" w:evenVBand="0" w:oddHBand="0" w:evenHBand="0" w:firstRowFirstColumn="0" w:firstRowLastColumn="0" w:lastRowFirstColumn="0" w:lastRowLastColumn="0"/>
+            <w:tcW w:w="1390" w:type="dxa"/>
           </w:tcPr>
           <w:p>
             <w:pPr>
@@ -3224,10 +2960,11 @@
         </w:tc>
         <w:tc>
           <w:tcPr>
-            <w:tcW w:w="0" w:type="dxa"/>
+            <w:tcW w:w="1386" w:type="dxa"/>
           </w:tcPr>
           <w:p>
             <w:pPr>
+              <w:cnfStyle w:val="000000100000" w:firstRow="0" w:lastRow="0" w:firstColumn="0" w:lastColumn="0" w:oddVBand="0" w:evenVBand="0" w:oddHBand="1" w:evenHBand="0" w:firstRowFirstColumn="0" w:firstRowLastColumn="0" w:lastRowFirstColumn="0" w:lastRowLastColumn="0"/>
               <w:rPr>
                 <w:rFonts w:ascii="Times New Roman" w:hAnsi="Times New Roman" w:cs="Times New Roman"/>
                 <w:sz w:val="24"/>
@@ -3246,10 +2983,11 @@
         </w:tc>
         <w:tc>
           <w:tcPr>
-            <w:tcW w:w="0" w:type="dxa"/>
+            <w:tcW w:w="2282" w:type="dxa"/>
           </w:tcPr>
           <w:p>
             <w:pPr>
+              <w:cnfStyle w:val="000000100000" w:firstRow="0" w:lastRow="0" w:firstColumn="0" w:lastColumn="0" w:oddVBand="0" w:evenVBand="0" w:oddHBand="1" w:evenHBand="0" w:firstRowFirstColumn="0" w:firstRowLastColumn="0" w:lastRowFirstColumn="0" w:lastRowLastColumn="0"/>
               <w:rPr>
                 <w:rFonts w:ascii="Times New Roman" w:hAnsi="Times New Roman" w:cs="Times New Roman"/>
                 <w:sz w:val="24"/>
@@ -3270,7 +3008,8 @@
       <w:tr>
         <w:tc>
           <w:tcPr>
-            <w:tcW w:w="0" w:type="dxa"/>
+            <w:cnfStyle w:val="001000000000" w:firstRow="0" w:lastRow="0" w:firstColumn="1" w:lastColumn="0" w:oddVBand="0" w:evenVBand="0" w:oddHBand="0" w:evenHBand="0" w:firstRowFirstColumn="0" w:firstRowLastColumn="0" w:lastRowFirstColumn="0" w:lastRowLastColumn="0"/>
+            <w:tcW w:w="1390" w:type="dxa"/>
           </w:tcPr>
           <w:p>
             <w:pPr>
@@ -3292,10 +3031,11 @@
         </w:tc>
         <w:tc>
           <w:tcPr>
-            <w:tcW w:w="0" w:type="dxa"/>
+            <w:tcW w:w="1386" w:type="dxa"/>
           </w:tcPr>
           <w:p>
             <w:pPr>
+              <w:cnfStyle w:val="000000000000" w:firstRow="0" w:lastRow="0" w:firstColumn="0" w:lastColumn="0" w:oddVBand="0" w:evenVBand="0" w:oddHBand="0" w:evenHBand="0" w:firstRowFirstColumn="0" w:firstRowLastColumn="0" w:lastRowFirstColumn="0" w:lastRowLastColumn="0"/>
               <w:rPr>
                 <w:rFonts w:ascii="Times New Roman" w:hAnsi="Times New Roman" w:cs="Times New Roman"/>
                 <w:sz w:val="24"/>
@@ -3314,10 +3054,11 @@
         </w:tc>
         <w:tc>
           <w:tcPr>
-            <w:tcW w:w="0" w:type="dxa"/>
+            <w:tcW w:w="2282" w:type="dxa"/>
           </w:tcPr>
           <w:p>
             <w:pPr>
+              <w:cnfStyle w:val="000000000000" w:firstRow="0" w:lastRow="0" w:firstColumn="0" w:lastColumn="0" w:oddVBand="0" w:evenVBand="0" w:oddHBand="0" w:evenHBand="0" w:firstRowFirstColumn="0" w:firstRowLastColumn="0" w:lastRowFirstColumn="0" w:lastRowLastColumn="0"/>
               <w:rPr>
                 <w:rFonts w:ascii="Times New Roman" w:hAnsi="Times New Roman" w:cs="Times New Roman"/>
                 <w:sz w:val="24"/>
@@ -3336,9 +3077,13 @@
         </w:tc>
       </w:tr>
       <w:tr>
+        <w:trPr>
+          <w:cnfStyle w:val="000000100000" w:firstRow="0" w:lastRow="0" w:firstColumn="0" w:lastColumn="0" w:oddVBand="0" w:evenVBand="0" w:oddHBand="1" w:evenHBand="0" w:firstRowFirstColumn="0" w:firstRowLastColumn="0" w:lastRowFirstColumn="0" w:lastRowLastColumn="0"/>
+        </w:trPr>
         <w:tc>
           <w:tcPr>
-            <w:tcW w:w="0" w:type="dxa"/>
+            <w:cnfStyle w:val="001000000000" w:firstRow="0" w:lastRow="0" w:firstColumn="1" w:lastColumn="0" w:oddVBand="0" w:evenVBand="0" w:oddHBand="0" w:evenHBand="0" w:firstRowFirstColumn="0" w:firstRowLastColumn="0" w:lastRowFirstColumn="0" w:lastRowLastColumn="0"/>
+            <w:tcW w:w="1390" w:type="dxa"/>
           </w:tcPr>
           <w:p>
             <w:pPr>
@@ -3360,10 +3105,11 @@
         </w:tc>
         <w:tc>
           <w:tcPr>
-            <w:tcW w:w="0" w:type="dxa"/>
+            <w:tcW w:w="1386" w:type="dxa"/>
           </w:tcPr>
           <w:p>
             <w:pPr>
+              <w:cnfStyle w:val="000000100000" w:firstRow="0" w:lastRow="0" w:firstColumn="0" w:lastColumn="0" w:oddVBand="0" w:evenVBand="0" w:oddHBand="1" w:evenHBand="0" w:firstRowFirstColumn="0" w:firstRowLastColumn="0" w:lastRowFirstColumn="0" w:lastRowLastColumn="0"/>
               <w:rPr>
                 <w:rFonts w:ascii="Times New Roman" w:hAnsi="Times New Roman" w:cs="Times New Roman"/>
                 <w:sz w:val="24"/>
@@ -3382,10 +3128,11 @@
         </w:tc>
         <w:tc>
           <w:tcPr>
-            <w:tcW w:w="0" w:type="dxa"/>
+            <w:tcW w:w="2282" w:type="dxa"/>
           </w:tcPr>
           <w:p>
             <w:pPr>
+              <w:cnfStyle w:val="000000100000" w:firstRow="0" w:lastRow="0" w:firstColumn="0" w:lastColumn="0" w:oddVBand="0" w:evenVBand="0" w:oddHBand="1" w:evenHBand="0" w:firstRowFirstColumn="0" w:firstRowLastColumn="0" w:lastRowFirstColumn="0" w:lastRowLastColumn="0"/>
               <w:rPr>
                 <w:rFonts w:ascii="Times New Roman" w:hAnsi="Times New Roman" w:cs="Times New Roman"/>
                 <w:sz w:val="24"/>
@@ -3406,7 +3153,8 @@
       <w:tr>
         <w:tc>
           <w:tcPr>
-            <w:tcW w:w="0" w:type="dxa"/>
+            <w:cnfStyle w:val="001000000000" w:firstRow="0" w:lastRow="0" w:firstColumn="1" w:lastColumn="0" w:oddVBand="0" w:evenVBand="0" w:oddHBand="0" w:evenHBand="0" w:firstRowFirstColumn="0" w:firstRowLastColumn="0" w:lastRowFirstColumn="0" w:lastRowLastColumn="0"/>
+            <w:tcW w:w="1390" w:type="dxa"/>
           </w:tcPr>
           <w:p>
             <w:pPr>
@@ -3428,10 +3176,11 @@
         </w:tc>
         <w:tc>
           <w:tcPr>
-            <w:tcW w:w="0" w:type="dxa"/>
+            <w:tcW w:w="1386" w:type="dxa"/>
           </w:tcPr>
           <w:p>
             <w:pPr>
+              <w:cnfStyle w:val="000000000000" w:firstRow="0" w:lastRow="0" w:firstColumn="0" w:lastColumn="0" w:oddVBand="0" w:evenVBand="0" w:oddHBand="0" w:evenHBand="0" w:firstRowFirstColumn="0" w:firstRowLastColumn="0" w:lastRowFirstColumn="0" w:lastRowLastColumn="0"/>
               <w:rPr>
                 <w:rFonts w:ascii="Times New Roman" w:hAnsi="Times New Roman" w:cs="Times New Roman"/>
                 <w:sz w:val="24"/>
@@ -3450,10 +3199,11 @@
         </w:tc>
         <w:tc>
           <w:tcPr>
-            <w:tcW w:w="0" w:type="dxa"/>
+            <w:tcW w:w="2282" w:type="dxa"/>
           </w:tcPr>
           <w:p>
             <w:pPr>
+              <w:cnfStyle w:val="000000000000" w:firstRow="0" w:lastRow="0" w:firstColumn="0" w:lastColumn="0" w:oddVBand="0" w:evenVBand="0" w:oddHBand="0" w:evenHBand="0" w:firstRowFirstColumn="0" w:firstRowLastColumn="0" w:lastRowFirstColumn="0" w:lastRowLastColumn="0"/>
               <w:rPr>
                 <w:rFonts w:ascii="Times New Roman" w:hAnsi="Times New Roman" w:cs="Times New Roman"/>
                 <w:sz w:val="24"/>
@@ -3486,245 +3236,7 @@
           <w:sz w:val="24"/>
           <w:szCs w:val="24"/>
         </w:rPr>
-        <w:t xml:space="preserve"> </w:t>
-      </w:r>
-    </w:p>
-    <w:p>
-      <w:pPr>
-        <w:rPr>
-          <w:rFonts w:ascii="Times New Roman" w:hAnsi="Times New Roman" w:cs="Times New Roman"/>
-          <w:sz w:val="24"/>
-          <w:szCs w:val="24"/>
-        </w:rPr>
-      </w:pPr>
-      <w:r>
-        <w:rPr>
-          <w:rFonts w:ascii="Times New Roman" w:hAnsi="Times New Roman" w:cs="Times New Roman"/>
-          <w:sz w:val="24"/>
-          <w:szCs w:val="24"/>
-        </w:rPr>
-        <w:t xml:space="preserve"> </w:t>
-      </w:r>
-    </w:p>
-    <w:p>
-      <w:pPr>
-        <w:rPr>
-          <w:rFonts w:ascii="Times New Roman" w:hAnsi="Times New Roman" w:cs="Times New Roman"/>
-          <w:sz w:val="24"/>
-          <w:szCs w:val="24"/>
-        </w:rPr>
-      </w:pPr>
-      <w:r>
-        <w:rPr>
-          <w:rFonts w:ascii="Times New Roman" w:hAnsi="Times New Roman" w:cs="Times New Roman"/>
-          <w:sz w:val="24"/>
-          <w:szCs w:val="24"/>
-        </w:rPr>
-        <w:t xml:space="preserve"> </w:t>
-      </w:r>
-    </w:p>
-    <w:p>
-      <w:pPr>
-        <w:rPr>
-          <w:rFonts w:ascii="Times New Roman" w:hAnsi="Times New Roman" w:cs="Times New Roman"/>
-          <w:sz w:val="24"/>
-          <w:szCs w:val="24"/>
-        </w:rPr>
-      </w:pPr>
-      <w:r>
-        <w:rPr>
-          <w:rFonts w:ascii="Times New Roman" w:hAnsi="Times New Roman" w:cs="Times New Roman"/>
-          <w:sz w:val="24"/>
-          <w:szCs w:val="24"/>
-        </w:rPr>
-        <w:t xml:space="preserve"> </w:t>
-      </w:r>
-    </w:p>
-    <w:p>
-      <w:pPr>
-        <w:rPr>
-          <w:rFonts w:ascii="Times New Roman" w:hAnsi="Times New Roman" w:cs="Times New Roman"/>
-          <w:sz w:val="24"/>
-          <w:szCs w:val="24"/>
-        </w:rPr>
-      </w:pPr>
-      <w:r>
-        <w:rPr>
-          <w:rFonts w:ascii="Times New Roman" w:hAnsi="Times New Roman" w:cs="Times New Roman"/>
-          <w:sz w:val="24"/>
-          <w:szCs w:val="24"/>
-        </w:rPr>
-        <w:t xml:space="preserve"> </w:t>
-      </w:r>
-    </w:p>
-    <w:p>
-      <w:pPr>
-        <w:rPr>
-          <w:rFonts w:ascii="Times New Roman" w:hAnsi="Times New Roman" w:cs="Times New Roman"/>
-          <w:sz w:val="24"/>
-          <w:szCs w:val="24"/>
-        </w:rPr>
-      </w:pPr>
-      <w:r>
-        <w:rPr>
-          <w:rFonts w:ascii="Times New Roman" w:hAnsi="Times New Roman" w:cs="Times New Roman"/>
-          <w:sz w:val="24"/>
-          <w:szCs w:val="24"/>
-        </w:rPr>
-        <w:t xml:space="preserve"> </w:t>
-      </w:r>
-    </w:p>
-    <w:p>
-      <w:pPr>
-        <w:rPr>
-          <w:rFonts w:ascii="Times New Roman" w:hAnsi="Times New Roman" w:cs="Times New Roman"/>
-          <w:sz w:val="24"/>
-          <w:szCs w:val="24"/>
-        </w:rPr>
-      </w:pPr>
-      <w:r>
-        <w:rPr>
-          <w:rFonts w:ascii="Times New Roman" w:hAnsi="Times New Roman" w:cs="Times New Roman"/>
-          <w:sz w:val="24"/>
-          <w:szCs w:val="24"/>
-        </w:rPr>
-        <w:t xml:space="preserve"> </w:t>
-      </w:r>
-    </w:p>
-    <w:p>
-      <w:pPr>
-        <w:rPr>
-          <w:rFonts w:ascii="Times New Roman" w:hAnsi="Times New Roman" w:cs="Times New Roman"/>
-          <w:sz w:val="24"/>
-          <w:szCs w:val="24"/>
-        </w:rPr>
-      </w:pPr>
-      <w:r>
-        <w:rPr>
-          <w:rFonts w:ascii="Times New Roman" w:hAnsi="Times New Roman" w:cs="Times New Roman"/>
-          <w:sz w:val="24"/>
-          <w:szCs w:val="24"/>
-        </w:rPr>
-        <w:t xml:space="preserve"> </w:t>
-      </w:r>
-    </w:p>
-    <w:p>
-      <w:pPr>
-        <w:rPr>
-          <w:rFonts w:ascii="Times New Roman" w:hAnsi="Times New Roman" w:cs="Times New Roman"/>
-          <w:sz w:val="24"/>
-          <w:szCs w:val="24"/>
-        </w:rPr>
-      </w:pPr>
-      <w:r>
-        <w:rPr>
-          <w:rFonts w:ascii="Times New Roman" w:hAnsi="Times New Roman" w:cs="Times New Roman"/>
-          <w:sz w:val="24"/>
-          <w:szCs w:val="24"/>
-        </w:rPr>
-        <w:t xml:space="preserve"> </w:t>
-      </w:r>
-    </w:p>
-    <w:p>
-      <w:pPr>
-        <w:rPr>
-          <w:rFonts w:ascii="Times New Roman" w:hAnsi="Times New Roman" w:cs="Times New Roman"/>
-          <w:sz w:val="24"/>
-          <w:szCs w:val="24"/>
-        </w:rPr>
-      </w:pPr>
-      <w:r>
-        <w:rPr>
-          <w:rFonts w:ascii="Times New Roman" w:hAnsi="Times New Roman" w:cs="Times New Roman"/>
-          <w:sz w:val="24"/>
-          <w:szCs w:val="24"/>
-        </w:rPr>
-        <w:t xml:space="preserve"> </w:t>
-      </w:r>
-    </w:p>
-    <w:p>
-      <w:pPr>
-        <w:rPr>
-          <w:rFonts w:ascii="Times New Roman" w:hAnsi="Times New Roman" w:cs="Times New Roman"/>
-          <w:sz w:val="24"/>
-          <w:szCs w:val="24"/>
-        </w:rPr>
-      </w:pPr>
-      <w:r>
-        <w:rPr>
-          <w:rFonts w:ascii="Times New Roman" w:hAnsi="Times New Roman" w:cs="Times New Roman"/>
-          <w:sz w:val="24"/>
-          <w:szCs w:val="24"/>
-        </w:rPr>
-        <w:t xml:space="preserve"> </w:t>
-      </w:r>
-    </w:p>
-    <w:p>
-      <w:pPr>
-        <w:rPr>
-          <w:rFonts w:ascii="Times New Roman" w:hAnsi="Times New Roman" w:cs="Times New Roman"/>
-          <w:sz w:val="24"/>
-          <w:szCs w:val="24"/>
-        </w:rPr>
-      </w:pPr>
-      <w:r>
-        <w:rPr>
-          <w:rFonts w:ascii="Times New Roman" w:hAnsi="Times New Roman" w:cs="Times New Roman"/>
-          <w:sz w:val="24"/>
-          <w:szCs w:val="24"/>
-        </w:rPr>
-        <w:t xml:space="preserve"> </w:t>
-      </w:r>
-    </w:p>
-    <w:p>
-      <w:pPr>
-        <w:rPr>
-          <w:rFonts w:ascii="Times New Roman" w:hAnsi="Times New Roman" w:cs="Times New Roman"/>
-          <w:sz w:val="24"/>
-          <w:szCs w:val="24"/>
-        </w:rPr>
-      </w:pPr>
-      <w:r>
-        <w:rPr>
-          <w:rFonts w:ascii="Times New Roman" w:hAnsi="Times New Roman" w:cs="Times New Roman"/>
-          <w:sz w:val="24"/>
-          <w:szCs w:val="24"/>
-        </w:rPr>
-        <w:t xml:space="preserve"> </w:t>
-      </w:r>
-    </w:p>
-    <w:p>
-      <w:pPr>
-        <w:rPr>
-          <w:rFonts w:ascii="Times New Roman" w:hAnsi="Times New Roman" w:cs="Times New Roman"/>
-          <w:sz w:val="24"/>
-          <w:szCs w:val="24"/>
-        </w:rPr>
-      </w:pPr>
-      <w:r>
-        <w:rPr>
-          <w:rFonts w:ascii="Times New Roman" w:hAnsi="Times New Roman" w:cs="Times New Roman"/>
-          <w:sz w:val="24"/>
-          <w:szCs w:val="24"/>
-        </w:rPr>
-        <w:t xml:space="preserve"> </w:t>
-      </w:r>
-    </w:p>
-    <w:p>
-      <w:pPr>
-        <w:rPr>
-          <w:rFonts w:ascii="Times New Roman" w:hAnsi="Times New Roman" w:cs="Times New Roman"/>
-          <w:sz w:val="24"/>
-          <w:szCs w:val="24"/>
-        </w:rPr>
-      </w:pPr>
-      <w:r>
-        <w:rPr>
-          <w:rFonts w:ascii="Times New Roman" w:hAnsi="Times New Roman" w:cs="Times New Roman"/>
-          <w:sz w:val="24"/>
-          <w:szCs w:val="24"/>
-        </w:rPr>
-        <w:t xml:space="preserve"> Random baseline on this hard set is higher for Hit Rate@10 (~0.50), revealing a ranking gap.</w:t>
+        <w:t>Random baseline on this hard set is higher for Hit Rate@10 (~0.50), revealing a ranking gap.</w:t>
       </w:r>
     </w:p>
     <w:p>
@@ -3759,8 +3271,35 @@
           <w:sz w:val="24"/>
           <w:szCs w:val="24"/>
         </w:rPr>
-        <w:t>scripts/eval_fidelity.py runs paired tests with and without history (include_history=true/false) and compares rating error, token similarity, and tone match. This isolates the contribution of silent context retrieval.</w:t>
+        <w:t>scripts/eval_fidelity.py runs paired tests with and without history (</w:t>
       </w:r>
+      <w:proofErr w:type="gramStart"/>
+      <w:r>
+        <w:rPr>
+          <w:rFonts w:ascii="Times New Roman" w:hAnsi="Times New Roman" w:cs="Times New Roman"/>
+          <w:sz w:val="24"/>
+          <w:szCs w:val="24"/>
+        </w:rPr>
+        <w:t>include</w:t>
+      </w:r>
+      <w:proofErr w:type="gramEnd"/>
+      <w:r>
+        <w:rPr>
+          <w:rFonts w:ascii="Times New Roman" w:hAnsi="Times New Roman" w:cs="Times New Roman"/>
+          <w:sz w:val="24"/>
+          <w:szCs w:val="24"/>
+        </w:rPr>
+        <w:t>_history=true/false) and compares rating error, token similarity, and tone match. This isolates the contribution of silent context retrieval.</w:t>
+      </w:r>
+    </w:p>
+    <w:p>
+      <w:pPr>
+        <w:rPr>
+          <w:rFonts w:ascii="Times New Roman" w:hAnsi="Times New Roman" w:cs="Times New Roman"/>
+          <w:sz w:val="24"/>
+          <w:szCs w:val="24"/>
+        </w:rPr>
+      </w:pPr>
     </w:p>
     <w:p>
       <w:pPr>
@@ -3794,13 +3333,51 @@
           <w:sz w:val="24"/>
           <w:szCs w:val="24"/>
         </w:rPr>
-        <w:t>Environment: Python 3.11+, pip install -r requirements.txt, and .env from .env.example.</w:t>
+        <w:t xml:space="preserve">Environment: Python 3.11+, pip install -r requirements.txt, </w:t>
+      </w:r>
+      <w:proofErr w:type="gramStart"/>
+      <w:r>
+        <w:rPr>
+          <w:rFonts w:ascii="Times New Roman" w:hAnsi="Times New Roman" w:cs="Times New Roman"/>
+          <w:sz w:val="24"/>
+          <w:szCs w:val="24"/>
+        </w:rPr>
+        <w:t>and .env</w:t>
+      </w:r>
+      <w:proofErr w:type="gramEnd"/>
+      <w:r>
+        <w:rPr>
+          <w:rFonts w:ascii="Times New Roman" w:hAnsi="Times New Roman" w:cs="Times New Roman"/>
+          <w:sz w:val="24"/>
+          <w:szCs w:val="24"/>
+        </w:rPr>
+        <w:t xml:space="preserve"> </w:t>
+      </w:r>
+      <w:proofErr w:type="gramStart"/>
+      <w:r>
+        <w:rPr>
+          <w:rFonts w:ascii="Times New Roman" w:hAnsi="Times New Roman" w:cs="Times New Roman"/>
+          <w:sz w:val="24"/>
+          <w:szCs w:val="24"/>
+        </w:rPr>
+        <w:t>from .env</w:t>
+      </w:r>
+      <w:proofErr w:type="gramEnd"/>
+      <w:r>
+        <w:rPr>
+          <w:rFonts w:ascii="Times New Roman" w:hAnsi="Times New Roman" w:cs="Times New Roman"/>
+          <w:sz w:val="24"/>
+          <w:szCs w:val="24"/>
+        </w:rPr>
+        <w:t>.example.</w:t>
       </w:r>
     </w:p>
     <w:p>
       <w:pPr>
         <w:rPr>
           <w:rFonts w:ascii="Times New Roman" w:hAnsi="Times New Roman" w:cs="Times New Roman"/>
+          <w:b/>
+          <w:bCs/>
           <w:sz w:val="24"/>
           <w:szCs w:val="24"/>
         </w:rPr>
@@ -3808,6 +3385,8 @@
       <w:r>
         <w:rPr>
           <w:rFonts w:ascii="Times New Roman" w:hAnsi="Times New Roman" w:cs="Times New Roman"/>
+          <w:b/>
+          <w:bCs/>
           <w:sz w:val="24"/>
           <w:szCs w:val="24"/>
         </w:rPr>
@@ -3845,7 +3424,6 @@
           <w:sz w:val="24"/>
           <w:szCs w:val="24"/>
         </w:rPr>
-        <w:lastRenderedPageBreak/>
         <w:t>Core endpoints: http://localhost:8000 (API), http://localhost:8000/docs (Swagger), http://localhost:3000/unified (Hub UI).</w:t>
       </w:r>
       <w:r>
@@ -3855,8 +3433,45 @@
           <w:szCs w:val="24"/>
         </w:rPr>
         <w:br/>
-        <w:t xml:space="preserve"> Evaluation: python scripts/run_real_benchmark.py --all_variants and python scripts/eval_fidelity.py.</w:t>
+        <w:t xml:space="preserve"> Evaluation: python </w:t>
       </w:r>
+      <w:proofErr w:type="gramStart"/>
+      <w:r>
+        <w:rPr>
+          <w:rFonts w:ascii="Times New Roman" w:hAnsi="Times New Roman" w:cs="Times New Roman"/>
+          <w:sz w:val="24"/>
+          <w:szCs w:val="24"/>
+        </w:rPr>
+        <w:t>scripts/run_real_benchmark.py --</w:t>
+      </w:r>
+      <w:proofErr w:type="spellStart"/>
+      <w:proofErr w:type="gramEnd"/>
+      <w:r>
+        <w:rPr>
+          <w:rFonts w:ascii="Times New Roman" w:hAnsi="Times New Roman" w:cs="Times New Roman"/>
+          <w:sz w:val="24"/>
+          <w:szCs w:val="24"/>
+        </w:rPr>
+        <w:t>all_variants</w:t>
+      </w:r>
+      <w:proofErr w:type="spellEnd"/>
+      <w:r>
+        <w:rPr>
+          <w:rFonts w:ascii="Times New Roman" w:hAnsi="Times New Roman" w:cs="Times New Roman"/>
+          <w:sz w:val="24"/>
+          <w:szCs w:val="24"/>
+        </w:rPr>
+        <w:t xml:space="preserve"> and python scripts/eval_fidelity.py.</w:t>
+      </w:r>
+    </w:p>
+    <w:p>
+      <w:pPr>
+        <w:rPr>
+          <w:rFonts w:ascii="Times New Roman" w:hAnsi="Times New Roman" w:cs="Times New Roman"/>
+          <w:sz w:val="24"/>
+          <w:szCs w:val="24"/>
+        </w:rPr>
+      </w:pPr>
     </w:p>
     <w:p>
       <w:pPr>
@@ -3879,6 +3494,10 @@
     <w:p>
       <w:pPr>
         <w:pStyle w:val="ListNumber"/>
+        <w:numPr>
+          <w:ilvl w:val="0"/>
+          <w:numId w:val="10"/>
+        </w:numPr>
         <w:rPr>
           <w:rFonts w:ascii="Times New Roman" w:hAnsi="Times New Roman" w:cs="Times New Roman"/>
           <w:sz w:val="24"/>
@@ -3900,7 +3519,25 @@
           <w:sz w:val="24"/>
           <w:szCs w:val="24"/>
         </w:rPr>
-        <w:t xml:space="preserve"> deterministic scorer needs LLM reranking over top-K to handle subtle same-domain distractors.</w:t>
+        <w:t xml:space="preserve"> deterministic scorer needs LLM reranking over </w:t>
+      </w:r>
+      <w:proofErr w:type="gramStart"/>
+      <w:r>
+        <w:rPr>
+          <w:rFonts w:ascii="Times New Roman" w:hAnsi="Times New Roman" w:cs="Times New Roman"/>
+          <w:sz w:val="24"/>
+          <w:szCs w:val="24"/>
+        </w:rPr>
+        <w:t>top-K</w:t>
+      </w:r>
+      <w:proofErr w:type="gramEnd"/>
+      <w:r>
+        <w:rPr>
+          <w:rFonts w:ascii="Times New Roman" w:hAnsi="Times New Roman" w:cs="Times New Roman"/>
+          <w:sz w:val="24"/>
+          <w:szCs w:val="24"/>
+        </w:rPr>
+        <w:t xml:space="preserve"> to handle subtle same-domain distractors.</w:t>
       </w:r>
     </w:p>
     <w:p>
@@ -4010,6 +3647,20 @@
         </w:rPr>
         <w:t xml:space="preserve"> thumbs data is logged; next step is periodic distillation into adaptive few-shot banks.</w:t>
       </w:r>
+    </w:p>
+    <w:p>
+      <w:pPr>
+        <w:pStyle w:val="ListNumber"/>
+        <w:numPr>
+          <w:ilvl w:val="0"/>
+          <w:numId w:val="0"/>
+        </w:numPr>
+        <w:rPr>
+          <w:rFonts w:ascii="Times New Roman" w:hAnsi="Times New Roman" w:cs="Times New Roman"/>
+          <w:sz w:val="24"/>
+          <w:szCs w:val="24"/>
+        </w:rPr>
+      </w:pPr>
     </w:p>
     <w:p>
       <w:pPr>
@@ -4272,6 +3923,12 @@
   </w:num>
   <w:num w:numId="9" w16cid:durableId="1981498917">
     <w:abstractNumId w:val="0"/>
+  </w:num>
+  <w:num w:numId="10" w16cid:durableId="2017492912">
+    <w:abstractNumId w:val="7"/>
+    <w:lvlOverride w:ilvl="0">
+      <w:startOverride w:val="1"/>
+    </w:lvlOverride>
   </w:num>
 </w:numbering>
 </file>
@@ -15867,6 +15524,82 @@
       </w:tcPr>
     </w:tblStylePr>
   </w:style>
+  <w:style w:type="table" w:styleId="GridTable4-Accent3">
+    <w:name w:val="Grid Table 4 Accent 3"/>
+    <w:basedOn w:val="TableNormal"/>
+    <w:uiPriority w:val="49"/>
+    <w:rsid w:val="005667FA"/>
+    <w:pPr>
+      <w:spacing w:after="0" w:line="240" w:lineRule="auto"/>
+    </w:pPr>
+    <w:tblPr>
+      <w:tblStyleRowBandSize w:val="1"/>
+      <w:tblStyleColBandSize w:val="1"/>
+      <w:tblBorders>
+        <w:top w:val="single" w:sz="4" w:space="0" w:color="C2D69B" w:themeColor="accent3" w:themeTint="99"/>
+        <w:left w:val="single" w:sz="4" w:space="0" w:color="C2D69B" w:themeColor="accent3" w:themeTint="99"/>
+        <w:bottom w:val="single" w:sz="4" w:space="0" w:color="C2D69B" w:themeColor="accent3" w:themeTint="99"/>
+        <w:right w:val="single" w:sz="4" w:space="0" w:color="C2D69B" w:themeColor="accent3" w:themeTint="99"/>
+        <w:insideH w:val="single" w:sz="4" w:space="0" w:color="C2D69B" w:themeColor="accent3" w:themeTint="99"/>
+        <w:insideV w:val="single" w:sz="4" w:space="0" w:color="C2D69B" w:themeColor="accent3" w:themeTint="99"/>
+      </w:tblBorders>
+    </w:tblPr>
+    <w:tblStylePr w:type="firstRow">
+      <w:rPr>
+        <w:b/>
+        <w:bCs/>
+        <w:color w:val="FFFFFF" w:themeColor="background1"/>
+      </w:rPr>
+      <w:tblPr/>
+      <w:tcPr>
+        <w:tcBorders>
+          <w:top w:val="single" w:sz="4" w:space="0" w:color="9BBB59" w:themeColor="accent3"/>
+          <w:left w:val="single" w:sz="4" w:space="0" w:color="9BBB59" w:themeColor="accent3"/>
+          <w:bottom w:val="single" w:sz="4" w:space="0" w:color="9BBB59" w:themeColor="accent3"/>
+          <w:right w:val="single" w:sz="4" w:space="0" w:color="9BBB59" w:themeColor="accent3"/>
+          <w:insideH w:val="nil"/>
+          <w:insideV w:val="nil"/>
+        </w:tcBorders>
+        <w:shd w:val="clear" w:color="auto" w:fill="9BBB59" w:themeFill="accent3"/>
+      </w:tcPr>
+    </w:tblStylePr>
+    <w:tblStylePr w:type="lastRow">
+      <w:rPr>
+        <w:b/>
+        <w:bCs/>
+      </w:rPr>
+      <w:tblPr/>
+      <w:tcPr>
+        <w:tcBorders>
+          <w:top w:val="double" w:sz="4" w:space="0" w:color="9BBB59" w:themeColor="accent3"/>
+        </w:tcBorders>
+      </w:tcPr>
+    </w:tblStylePr>
+    <w:tblStylePr w:type="firstCol">
+      <w:rPr>
+        <w:b/>
+        <w:bCs/>
+      </w:rPr>
+    </w:tblStylePr>
+    <w:tblStylePr w:type="lastCol">
+      <w:rPr>
+        <w:b/>
+        <w:bCs/>
+      </w:rPr>
+    </w:tblStylePr>
+    <w:tblStylePr w:type="band1Vert">
+      <w:tblPr/>
+      <w:tcPr>
+        <w:shd w:val="clear" w:color="auto" w:fill="EAF1DD" w:themeFill="accent3" w:themeFillTint="33"/>
+      </w:tcPr>
+    </w:tblStylePr>
+    <w:tblStylePr w:type="band1Horz">
+      <w:tblPr/>
+      <w:tcPr>
+        <w:shd w:val="clear" w:color="auto" w:fill="EAF1DD" w:themeFill="accent3" w:themeFillTint="33"/>
+      </w:tcPr>
+    </w:tblStylePr>
+  </w:style>
 </w:styles>
 </file>
 

</xml_diff>